<commit_message>
Stage-9 temporal fix: order same-day notes after their events
Final AutoQC flagged three notes signed before same-day events they describe.
Fixed at source (clinical_data.py): HD2 progress 0930->1700 (after debridement
1440), ID consult 1540->1745 (after MRI 1705), HD4 progress 0915->1730 (after
vascular consult 1635). Swept all same-day clusters; no other conflicts.
Task files made strictly after the 18:00 close (task_data.py): T1 1800->1830,
T2 and T10 dated 05/21 1830 - removes any tasking date ambiguity. Rebuilt
world+task files, regenerated revision/filesystem, gate green.
</commit_message>
<xml_diff>
--- a/worlds/ondina-vasquell/file-review/revision/filesystem/clinical/hospitalist_progress_hd2_05172026.docx
+++ b/worlds/ondina-vasquell/file-review/revision/filesystem/clinical/hospitalist_progress_hd2_05172026.docx
@@ -197,7 +197,7 @@
                 <w:color w:val="232830"/>
                 <w:sz w:val="16"/>
               </w:rPr>
-              <w:t>05/17/2026 0930</w:t>
+              <w:t>05/17/2026 1700</w:t>
             </w:r>
           </w:p>
         </w:tc>
@@ -312,7 +312,7 @@
           <w:color w:val="5E6670"/>
           <w:sz w:val="16"/>
         </w:rPr>
-        <w:t>Author: Lillian Everet, MD - Hospital Medicine | Date of Service: 05/17/2026 0930 | Status: Signed</w:t>
+        <w:t>Author: Lillian Everet, MD - Hospital Medicine | Date of Service: 05/17/2026 1700 | Status: Signed</w:t>
       </w:r>
     </w:p>
     <w:p>
@@ -528,7 +528,7 @@
           <w:color w:val="232830"/>
           <w:sz w:val="18"/>
         </w:rPr>
-        <w:t>05/17/2026 0930</w:t>
+        <w:t>05/17/2026 1700</w:t>
       </w:r>
     </w:p>
     <w:p>
@@ -774,7 +774,7 @@
           <w:color w:val="5E6670"/>
           <w:sz w:val="18"/>
         </w:rPr>
-        <w:t>Electronically signed by Lillian Everet, MD on 05/17/2026 0930</w:t>
+        <w:t>Electronically signed by Lillian Everet, MD on 05/17/2026 1700</w:t>
       </w:r>
     </w:p>
     <w:sectPr>

</xml_diff>